<commit_message>
Update visualization design document
</commit_message>
<xml_diff>
--- a/DS4200_Visualization_Design.docx
+++ b/DS4200_Visualization_Design.docx
@@ -48,6 +48,50 @@
     </w:p>
     <w:p>
       <w:pPr>
+        <w:spacing w:after="320"/>
+        <w:jc w:val="center"/>
+        <w:rPr>
+          <w:rFonts w:ascii="System Font" w:hAnsi="System Font" w:cs="System Font"/>
+          <w:sz w:val="30"/>
+          <w:szCs w:val="30"/>
+          <w:lang w:val="en-US"/>
+        </w:rPr>
+      </w:pPr>
+      <w:hyperlink r:id="rId5" w:history="1">
+        <w:r>
+          <w:rPr>
+            <w:rStyle w:val="Hyperlink"/>
+            <w:rFonts w:ascii="Times New Roman" w:hAnsi="Times New Roman" w:cs="Times New Roman"/>
+            <w:sz w:val="24"/>
+            <w:szCs w:val="24"/>
+          </w:rPr>
+          <w:t>Website</w:t>
+        </w:r>
+      </w:hyperlink>
+      <w:r>
+        <w:rPr>
+          <w:rFonts w:ascii="Times New Roman" w:hAnsi="Times New Roman" w:cs="Times New Roman"/>
+          <w:color w:val="000000" w:themeColor="text1"/>
+          <w:sz w:val="24"/>
+          <w:szCs w:val="24"/>
+        </w:rPr>
+        <w:t xml:space="preserve"> | </w:t>
+      </w:r>
+      <w:hyperlink r:id="rId6" w:history="1">
+        <w:r>
+          <w:rPr>
+            <w:rStyle w:val="Hyperlink"/>
+            <w:rFonts w:ascii="Times New Roman" w:hAnsi="Times New Roman" w:cs="Times New Roman"/>
+            <w:sz w:val="24"/>
+            <w:szCs w:val="24"/>
+            <w:lang w:val="en-US"/>
+          </w:rPr>
+          <w:t>Presentation</w:t>
+        </w:r>
+      </w:hyperlink>
+    </w:p>
+    <w:p>
+      <w:pPr>
         <w:pStyle w:val="Heading1"/>
         <w:jc w:val="both"/>
         <w:rPr>
@@ -394,6 +438,7 @@
           <w:sz w:val="24"/>
           <w:szCs w:val="24"/>
         </w:rPr>
+        <w:lastRenderedPageBreak/>
         <w:t xml:space="preserve">Color: </w:t>
       </w:r>
       <w:r>
@@ -426,7 +471,6 @@
           <w:sz w:val="24"/>
           <w:szCs w:val="24"/>
         </w:rPr>
-        <w:lastRenderedPageBreak/>
         <w:t xml:space="preserve">Size encoding: </w:t>
       </w:r>
       <w:r>
@@ -787,7 +831,17 @@
           <w:sz w:val="24"/>
           <w:szCs w:val="24"/>
         </w:rPr>
-        <w:t>Energy and loudness share the strongest positive correlation (r = 0.65), confirming that louder mixes are engineered for intensity. Acousticness is negatively correlated with both energy (r = −0.45) and loudness (r = −0.31), since acoustic recordings are inherently quieter and softer. Valence and danceability show a moderate positive correlation (r = 0.40), meaning happier-sounding songs tend to be more danceable. Notably, popularity is nearly uncorrelated with every other audio feature (all r values within ±0.05), indicating that chart success in this dataset cannot be strongly predicted from any single audio attribute alone.</w:t>
+        <w:t>Energy and loudness share the strongest positive correlation (r = 0.65), confirming that louder mixes are engineered for intensity. Acousticness is negatively correlated with both energy (r = −0.45) and loudness (r = −0.31), since acoustic recordings are inherently quieter and softer. Valence and danceability show a moderate positive correlation (r = 0.40), meaning happier-</w:t>
+      </w:r>
+      <w:r>
+        <w:rPr>
+          <w:rFonts w:ascii="Times New Roman" w:hAnsi="Times New Roman" w:cs="Times New Roman"/>
+          <w:color w:val="000000" w:themeColor="text1"/>
+          <w:sz w:val="24"/>
+          <w:szCs w:val="24"/>
+        </w:rPr>
+        <w:lastRenderedPageBreak/>
+        <w:t>sounding songs tend to be more danceable. Notably, popularity is nearly uncorrelated with every other audio feature (all r values within ±0.05), indicating that chart success in this dataset cannot be strongly predicted from any single audio attribute alone.</w:t>
       </w:r>
     </w:p>
     <w:p>
@@ -1181,7 +1235,7 @@
           <w:sz w:val="24"/>
           <w:szCs w:val="24"/>
         </w:rPr>
-        <w:t xml:space="preserve">Average energy starts very low in 1998 (approximately 0.45) — likely because the dataset contains very few tracks from that single year — then jumps sharply to approximately 0.74 by 1999 and remains elevated throughout the 2000s. It peaks around 2012–2013 at approximately 0.78, consistent with the loudness-war era and EDM's mainstream breakthrough. After that, energy dips gradually to a low of approximately 0.65 around 2018, before a sharp spike back to </w:t>
+        <w:t xml:space="preserve">Average energy starts very low in 1998 (approximately 0.45) — likely because the dataset contains very few tracks from that single year — then jumps sharply to approximately 0.74 </w:t>
       </w:r>
       <w:r>
         <w:rPr>
@@ -1191,7 +1245,7 @@
           <w:szCs w:val="24"/>
         </w:rPr>
         <w:lastRenderedPageBreak/>
-        <w:t>approximately 0.79 in 2020, possibly driven by a resurgence of high-production pop and hyperpop in the dataset's final year.</w:t>
+        <w:t>by 1999 and remains elevated throughout the 2000s. It peaks around 2012–2013 at approximately 0.78, consistent with the loudness-war era and EDM's mainstream breakthrough. After that, energy dips gradually to a low of approximately 0.65 around 2018, before a sharp spike back to approximately 0.79 in 2020, possibly driven by a resurgence of high-production pop and hyperpop in the dataset's final year.</w:t>
       </w:r>
     </w:p>
     <w:p>
@@ -2142,6 +2196,18 @@
       <w:szCs w:val="20"/>
     </w:rPr>
   </w:style>
+  <w:style w:type="character" w:styleId="UnresolvedMention">
+    <w:name w:val="Unresolved Mention"/>
+    <w:basedOn w:val="DefaultParagraphFont"/>
+    <w:uiPriority w:val="99"/>
+    <w:semiHidden/>
+    <w:unhideWhenUsed/>
+    <w:rsid w:val="00F360C4"/>
+    <w:rPr>
+      <w:color w:val="605E5C"/>
+      <w:shd w:val="clear" w:color="auto" w:fill="E1DFDD"/>
+    </w:rPr>
+  </w:style>
 </w:styles>
 </file>
 

</xml_diff>